<commit_message>
Tidied study notes to be more consistent. Completed for all topics.
Big tidy up of workshop folders, getting rid of material from before I took over course and old versions of instructions.
</commit_message>
<xml_diff>
--- a/Workshops/Workshop 10 - GLMs/Workshop-10---Fitting-Poisson-GLMs--with-answers-.docx
+++ b/Workshops/Workshop 10 - GLMs/Workshop-10---Fitting-Poisson-GLMs--with-answers-.docx
@@ -71,7 +71,7 @@
         <w:t xml:space="preserve"> </w:t>
       </w:r>
       <w:r>
-        <w:t xml:space="preserve">2024-10-10</w:t>
+        <w:t xml:space="preserve">2025-09-04</w:t>
       </w:r>
     </w:p>
     <w:sdt>
@@ -1671,7 +1671,7 @@
         <w:rPr>
           <w:rStyle w:val="CommentTok"/>
         </w:rPr>
-        <w:t xml:space="preserve"># We completely ignore the Q-Q plot for GLMs - remember, we're not assuming our residuals are Normally distributed anymore.</w:t>
+        <w:t xml:space="preserve"># We almost completely ignore the Q-Q plot for GLMs - remember, we're not assuming our residuals are Normally distributed anymore. Focus on the other diagnostics.</w:t>
       </w:r>
     </w:p>
     <w:p>
@@ -5221,22 +5221,9 @@
         </w:rPr>
         <w:t xml:space="preserve">(ggeffects)</w:t>
       </w:r>
-    </w:p>
-    <w:p>
-      <w:pPr>
-        <w:pStyle w:val="SourceCode"/>
-      </w:pPr>
-      <w:r>
-        <w:rPr>
-          <w:rStyle w:val="VerbatimChar"/>
-        </w:rPr>
-        <w:t xml:space="preserve">## Warning: package 'ggeffects' was built under R version 4.3.3</w:t>
-      </w:r>
-    </w:p>
-    <w:p>
-      <w:pPr>
-        <w:pStyle w:val="SourceCode"/>
-      </w:pPr>
+      <w:r>
+        <w:br/>
+      </w:r>
       <w:r>
         <w:rPr>
           <w:rStyle w:val="NormalTok"/>
@@ -5421,7 +5408,7 @@
         <w:rPr>
           <w:rStyle w:val="VerbatimChar"/>
         </w:rPr>
-        <w:t xml:space="preserve">## Warning: Some of the focal terms are of type `character`. This may lead to</w:t>
+        <w:t xml:space="preserve">## Some of the focal terms are of type `character`. This may lead to</w:t>
       </w:r>
       <w:r>
         <w:br/>
@@ -5448,7 +5435,7 @@
         <w:rPr>
           <w:rStyle w:val="VerbatimChar"/>
         </w:rPr>
-        <w:t xml:space="preserve">##   The following variables in are of type character: `pH`</w:t>
+        <w:t xml:space="preserve">##   The following variables are of type character: `pH`</w:t>
       </w:r>
     </w:p>
     <w:p>
@@ -5584,7 +5571,7 @@
         </w:numPr>
       </w:pPr>
       <w:r>
-        <w:t xml:space="preserve">If you found any typos, sections of the workshop materials, parts of lectures, or anything in general that felt confusing (given it’s a stats course…), then let me (Deon) know. Please. I genuinely think the material on this course is important to know, and if I’m not doing a good job of that, please tell me. Feel free to message via email or however you prefer. I’d really appreciate any comments or critques (just please don’t be cruel).</w:t>
+        <w:t xml:space="preserve">If you found any typos, sections of the workshop materials, parts of lectures, or anything in general that felt confusing (given it’s a stats course…), then let me (Deon) know. Please. I genuinely think the material on this course is important to know, and if I’m not doing a good job of that, please tell me. Feel free to message via email or however you prefer. I’d really appreciate any comments or critiques (just please don’t be needlessly cruel).</w:t>
       </w:r>
     </w:p>
     <w:bookmarkEnd w:id="45"/>
@@ -5621,7 +5608,7 @@
 </file>
 
 <file path=word/numbering.xml><?xml version="1.0" encoding="utf-8"?>
-<w:numbering xmlns:aink="http://schemas.microsoft.com/office/drawing/2016/ink" xmlns:am3d="http://schemas.microsoft.com/office/drawing/2017/model3d" xmlns:cx="http://schemas.microsoft.com/office/drawing/2014/chartex" xmlns:cx1="http://schemas.microsoft.com/office/drawing/2015/9/8/chartex" xmlns:cx2="http://schemas.microsoft.com/office/drawing/2015/10/21/chartex" xmlns:cx3="http://schemas.microsoft.com/office/drawing/2016/5/9/chartex" xmlns:cx4="http://schemas.microsoft.com/office/drawing/2016/5/10/chartex" xmlns:cx5="http://schemas.microsoft.com/office/drawing/2016/5/11/chartex" xmlns:cx6="http://schemas.microsoft.com/office/drawing/2016/5/12/chartex" xmlns:cx7="http://schemas.microsoft.com/office/drawing/2016/5/13/chartex" xmlns:cx8="http://schemas.microsoft.com/office/drawing/2016/5/14/chartex" xmlns:m="http://schemas.openxmlformats.org/officeDocument/2006/math" xmlns:mc="http://schemas.openxmlformats.org/markup-compatibility/2006" xmlns:o="urn:schemas-microsoft-com:office:office" xmlns:oel="http://schemas.microsoft.com/office/2019/extlst" xmlns:r="http://schemas.openxmlformats.org/officeDocument/2006/relationships" xmlns:v="urn:schemas-microsoft-com:vml" xmlns:w="http://schemas.openxmlformats.org/wordprocessingml/2006/main" xmlns:w10="urn:schemas-microsoft-com:office:word" xmlns:w14="http://schemas.microsoft.com/office/word/2010/wordml" xmlns:w15="http://schemas.microsoft.com/office/word/2012/wordml" xmlns:w16="http://schemas.microsoft.com/office/word/2018/wordml" xmlns:w16cex="http://schemas.microsoft.com/office/word/2018/wordml/cex" xmlns:w16cid="http://schemas.microsoft.com/office/word/2016/wordml/cid" xmlns:w16du="http://schemas.microsoft.com/office/word/2023/wordml/word16du" xmlns:w16sdtdh="http://schemas.microsoft.com/office/word/2020/wordml/sdtdatahash" xmlns:w16se="http://schemas.microsoft.com/office/word/2015/wordml/symex" xmlns:wne="http://schemas.microsoft.com/office/word/2006/wordml" xmlns:wp="http://schemas.openxmlformats.org/drawingml/2006/wordprocessingDrawing" xmlns:wp14="http://schemas.microsoft.com/office/word/2010/wordprocessingDrawing" xmlns:wpc="http://schemas.microsoft.com/office/word/2010/wordprocessingCanvas" xmlns:wpg="http://schemas.microsoft.com/office/word/2010/wordprocessingGroup" xmlns:wpi="http://schemas.microsoft.com/office/word/2010/wordprocessingInk" xmlns:wps="http://schemas.microsoft.com/office/word/2010/wordprocessingShape" mc:Ignorable="w14 w15 w16se w16cid w16 w16cex w16sdtdh w16du wp14">
+<w:numbering xmlns:aink="http://schemas.microsoft.com/office/drawing/2016/ink" xmlns:am3d="http://schemas.microsoft.com/office/drawing/2017/model3d" xmlns:cx="http://schemas.microsoft.com/office/drawing/2014/chartex" xmlns:cx1="http://schemas.microsoft.com/office/drawing/2015/9/8/chartex" xmlns:cx2="http://schemas.microsoft.com/office/drawing/2015/10/21/chartex" xmlns:cx3="http://schemas.microsoft.com/office/drawing/2016/5/9/chartex" xmlns:cx4="http://schemas.microsoft.com/office/drawing/2016/5/10/chartex" xmlns:cx5="http://schemas.microsoft.com/office/drawing/2016/5/11/chartex" xmlns:cx6="http://schemas.microsoft.com/office/drawing/2016/5/12/chartex" xmlns:cx7="http://schemas.microsoft.com/office/drawing/2016/5/13/chartex" xmlns:cx8="http://schemas.microsoft.com/office/drawing/2016/5/14/chartex" xmlns:m="http://schemas.openxmlformats.org/officeDocument/2006/math" xmlns:mc="http://schemas.openxmlformats.org/markup-compatibility/2006" xmlns:o="urn:schemas-microsoft-com:office:office" xmlns:oel="http://schemas.microsoft.com/office/2019/extlst" xmlns:r="http://schemas.openxmlformats.org/officeDocument/2006/relationships" xmlns:v="urn:schemas-microsoft-com:vml" xmlns:w="http://schemas.openxmlformats.org/wordprocessingml/2006/main" xmlns:w10="urn:schemas-microsoft-com:office:word" xmlns:w14="http://schemas.microsoft.com/office/word/2010/wordml" xmlns:w15="http://schemas.microsoft.com/office/word/2012/wordml" xmlns:w16="http://schemas.microsoft.com/office/word/2018/wordml" xmlns:w16cex="http://schemas.microsoft.com/office/word/2018/wordml/cex" xmlns:w16cid="http://schemas.microsoft.com/office/word/2016/wordml/cid" xmlns:w16du="http://schemas.microsoft.com/office/word/2023/wordml/word16du" xmlns:w16sdtdh="http://schemas.microsoft.com/office/word/2020/wordml/sdtdatahash" xmlns:w16sdtfl="http://schemas.microsoft.com/office/word/2024/wordml/sdtformatlock" xmlns:w16se="http://schemas.microsoft.com/office/word/2015/wordml/symex" xmlns:wne="http://schemas.microsoft.com/office/word/2006/wordml" xmlns:wp="http://schemas.openxmlformats.org/drawingml/2006/wordprocessingDrawing" xmlns:wp14="http://schemas.microsoft.com/office/word/2010/wordprocessingDrawing" xmlns:wpc="http://schemas.microsoft.com/office/word/2010/wordprocessingCanvas" xmlns:wpg="http://schemas.microsoft.com/office/word/2010/wordprocessingGroup" xmlns:wpi="http://schemas.microsoft.com/office/word/2010/wordprocessingInk" xmlns:wps="http://schemas.microsoft.com/office/word/2010/wordprocessingShape" mc:Ignorable="w14 w15 w16se w16cid w16 w16cex w16sdtdh w16sdtfl w16du wp14">
   <w:abstractNum w15:restartNumberingAfterBreak="0" w:abstractNumId="0">
     <w:nsid w:val="0000A990"/>
     <w:multiLevelType w:val="multilevel"/>
@@ -6990,7 +6977,7 @@
 </file>
 
 <file path=word/styles.xml><?xml version="1.0" encoding="utf-8"?>
-<w:styles xmlns:mc="http://schemas.openxmlformats.org/markup-compatibility/2006" xmlns:r="http://schemas.openxmlformats.org/officeDocument/2006/relationships" xmlns:w="http://schemas.openxmlformats.org/wordprocessingml/2006/main" xmlns:w14="http://schemas.microsoft.com/office/word/2010/wordml" xmlns:w15="http://schemas.microsoft.com/office/word/2012/wordml" xmlns:w16="http://schemas.microsoft.com/office/word/2018/wordml" xmlns:w16cex="http://schemas.microsoft.com/office/word/2018/wordml/cex" xmlns:w16cid="http://schemas.microsoft.com/office/word/2016/wordml/cid" xmlns:w16du="http://schemas.microsoft.com/office/word/2023/wordml/word16du" xmlns:w16sdtdh="http://schemas.microsoft.com/office/word/2020/wordml/sdtdatahash" xmlns:w16se="http://schemas.microsoft.com/office/word/2015/wordml/symex" mc:Ignorable="w14 w15 w16se w16cid w16 w16cex w16sdtdh w16du">
+<w:styles xmlns:mc="http://schemas.openxmlformats.org/markup-compatibility/2006" xmlns:r="http://schemas.openxmlformats.org/officeDocument/2006/relationships" xmlns:w="http://schemas.openxmlformats.org/wordprocessingml/2006/main" xmlns:w14="http://schemas.microsoft.com/office/word/2010/wordml" xmlns:w15="http://schemas.microsoft.com/office/word/2012/wordml" xmlns:w16="http://schemas.microsoft.com/office/word/2018/wordml" xmlns:w16cex="http://schemas.microsoft.com/office/word/2018/wordml/cex" xmlns:w16cid="http://schemas.microsoft.com/office/word/2016/wordml/cid" xmlns:w16du="http://schemas.microsoft.com/office/word/2023/wordml/word16du" xmlns:w16sdtdh="http://schemas.microsoft.com/office/word/2020/wordml/sdtdatahash" xmlns:w16sdtfl="http://schemas.microsoft.com/office/word/2024/wordml/sdtformatlock" xmlns:w16se="http://schemas.microsoft.com/office/word/2015/wordml/symex" mc:Ignorable="w14 w15 w16se w16cid w16 w16cex w16sdtdh w16sdtfl w16du">
   <w:docDefaults>
     <w:rPrDefault>
       <w:rPr>
@@ -7684,9 +7671,10 @@
     <w:name w:val="Verbatim Char"/>
     <w:basedOn w:val="CaptionChar"/>
     <w:link w:val="SourceCode"/>
-    <w:rsid w:val="00F34E30"/>
+    <w:rsid w:val="00796E50"/>
     <w:rPr>
       <w:rFonts w:ascii="Consolas" w:hAnsi="Consolas"/>
+      <w:sz w:val="22"/>
       <w:shd w:color="auto" w:fill="F8F8F8" w:val="clear"/>
     </w:rPr>
   </w:style>
@@ -7731,10 +7719,11 @@
     <w:name w:val="Source Code"/>
     <w:basedOn w:val="Normal"/>
     <w:link w:val="VerbatimChar"/>
-    <w:rsid w:val="00F34E30"/>
+    <w:rsid w:val="00796E50"/>
     <w:pPr>
       <w:shd w:color="auto" w:fill="F8F8F8" w:val="clear"/>
       <w:wordWrap w:val="0"/>
+      <w:textboxTightWrap w:val="allLines"/>
     </w:pPr>
     <w:rPr>
       <w:rFonts w:ascii="Consolas" w:hAnsi="Consolas"/>
@@ -7747,6 +7736,7 @@
       <w:rFonts w:ascii="Consolas" w:hAnsi="Consolas"/>
       <w:b/>
       <w:color w:val="204A87"/>
+      <w:sz w:val="22"/>
       <w:shd w:color="auto" w:fill="F8F8F8" w:val="clear"/>
     </w:rPr>
   </w:style>
@@ -7756,6 +7746,7 @@
     <w:rPr>
       <w:rFonts w:ascii="Consolas" w:hAnsi="Consolas"/>
       <w:color w:val="204A87"/>
+      <w:sz w:val="22"/>
       <w:shd w:color="auto" w:fill="F8F8F8" w:val="clear"/>
     </w:rPr>
   </w:style>
@@ -7765,6 +7756,7 @@
     <w:rPr>
       <w:rFonts w:ascii="Consolas" w:hAnsi="Consolas"/>
       <w:color w:val="0000CF"/>
+      <w:sz w:val="22"/>
       <w:shd w:color="auto" w:fill="F8F8F8" w:val="clear"/>
     </w:rPr>
   </w:style>
@@ -7774,6 +7766,7 @@
     <w:rPr>
       <w:rFonts w:ascii="Consolas" w:hAnsi="Consolas"/>
       <w:color w:val="0000CF"/>
+      <w:sz w:val="22"/>
       <w:shd w:color="auto" w:fill="F8F8F8" w:val="clear"/>
     </w:rPr>
   </w:style>
@@ -7783,6 +7776,7 @@
     <w:rPr>
       <w:rFonts w:ascii="Consolas" w:hAnsi="Consolas"/>
       <w:color w:val="0000CF"/>
+      <w:sz w:val="22"/>
       <w:shd w:color="auto" w:fill="F8F8F8" w:val="clear"/>
     </w:rPr>
   </w:style>
@@ -7793,6 +7787,7 @@
     <w:rPr>
       <w:rFonts w:ascii="Consolas" w:hAnsi="Consolas"/>
       <w:color w:themeColor="accent2" w:themeShade="BF" w:val="943634"/>
+      <w:sz w:val="22"/>
       <w:shd w:color="auto" w:fill="F8F8F8" w:val="clear"/>
     </w:rPr>
   </w:style>
@@ -7802,6 +7797,7 @@
     <w:rPr>
       <w:rFonts w:ascii="Consolas" w:hAnsi="Consolas"/>
       <w:color w:val="4E9A06"/>
+      <w:sz w:val="22"/>
       <w:shd w:color="auto" w:fill="F8F8F8" w:val="clear"/>
     </w:rPr>
   </w:style>
@@ -7812,6 +7808,7 @@
       <w:rFonts w:ascii="Consolas" w:hAnsi="Consolas"/>
       <w:b/>
       <w:color w:val="CE5C00"/>
+      <w:sz w:val="22"/>
       <w:shd w:color="auto" w:fill="F8F8F8" w:val="clear"/>
     </w:rPr>
   </w:style>
@@ -7821,6 +7818,7 @@
     <w:rPr>
       <w:rFonts w:ascii="Consolas" w:hAnsi="Consolas"/>
       <w:color w:val="4E9A06"/>
+      <w:sz w:val="22"/>
       <w:shd w:color="auto" w:fill="F8F8F8" w:val="clear"/>
     </w:rPr>
   </w:style>
@@ -7830,6 +7828,7 @@
     <w:rPr>
       <w:rFonts w:ascii="Consolas" w:hAnsi="Consolas"/>
       <w:color w:val="4E9A06"/>
+      <w:sz w:val="22"/>
       <w:shd w:color="auto" w:fill="F8F8F8" w:val="clear"/>
     </w:rPr>
   </w:style>
@@ -7839,6 +7838,7 @@
     <w:rPr>
       <w:rFonts w:ascii="Consolas" w:hAnsi="Consolas"/>
       <w:color w:val="4E9A06"/>
+      <w:sz w:val="22"/>
       <w:shd w:color="auto" w:fill="F8F8F8" w:val="clear"/>
     </w:rPr>
   </w:style>
@@ -7847,6 +7847,7 @@
     <w:basedOn w:val="VerbatimChar"/>
     <w:rPr>
       <w:rFonts w:ascii="Consolas" w:hAnsi="Consolas"/>
+      <w:sz w:val="22"/>
       <w:shd w:color="auto" w:fill="F8F8F8" w:val="clear"/>
     </w:rPr>
   </w:style>
@@ -7858,6 +7859,7 @@
       <w:rFonts w:ascii="Consolas" w:hAnsi="Consolas"/>
       <w:i/>
       <w:color w:themeColor="accent4" w:themeTint="99" w:val="B2A1C7"/>
+      <w:sz w:val="22"/>
       <w:shd w:color="auto" w:fill="F8F8F8" w:val="clear"/>
     </w:rPr>
   </w:style>
@@ -7869,6 +7871,7 @@
       <w:b/>
       <w:i/>
       <w:color w:val="8F5902"/>
+      <w:sz w:val="22"/>
       <w:shd w:color="auto" w:fill="F8F8F8" w:val="clear"/>
     </w:rPr>
   </w:style>
@@ -7880,6 +7883,7 @@
       <w:b/>
       <w:i/>
       <w:color w:val="8F5902"/>
+      <w:sz w:val="22"/>
       <w:shd w:color="auto" w:fill="F8F8F8" w:val="clear"/>
     </w:rPr>
   </w:style>
@@ -7891,6 +7895,7 @@
       <w:b/>
       <w:i/>
       <w:color w:val="8F5902"/>
+      <w:sz w:val="22"/>
       <w:shd w:color="auto" w:fill="F8F8F8" w:val="clear"/>
     </w:rPr>
   </w:style>
@@ -7900,6 +7905,7 @@
     <w:rPr>
       <w:rFonts w:ascii="Consolas" w:hAnsi="Consolas"/>
       <w:color w:val="8F5902"/>
+      <w:sz w:val="22"/>
       <w:shd w:color="auto" w:fill="F8F8F8" w:val="clear"/>
     </w:rPr>
   </w:style>
@@ -7911,6 +7917,7 @@
       <w:rFonts w:ascii="Consolas" w:hAnsi="Consolas"/>
       <w:b/>
       <w:color w:themeColor="accent6" w:val="F79646"/>
+      <w:sz w:val="22"/>
       <w:shd w:color="auto" w:fill="F8F8F8" w:val="clear"/>
     </w:rPr>
   </w:style>
@@ -7920,6 +7927,7 @@
     <w:rPr>
       <w:rFonts w:ascii="Consolas" w:hAnsi="Consolas"/>
       <w:color w:val="000000"/>
+      <w:sz w:val="22"/>
       <w:shd w:color="auto" w:fill="F8F8F8" w:val="clear"/>
     </w:rPr>
   </w:style>
@@ -7930,6 +7938,7 @@
       <w:rFonts w:ascii="Consolas" w:hAnsi="Consolas"/>
       <w:b/>
       <w:color w:val="204A87"/>
+      <w:sz w:val="22"/>
       <w:shd w:color="auto" w:fill="F8F8F8" w:val="clear"/>
     </w:rPr>
   </w:style>
@@ -7940,6 +7949,7 @@
       <w:rFonts w:ascii="Consolas" w:hAnsi="Consolas"/>
       <w:b/>
       <w:color w:val="CE5C00"/>
+      <w:sz w:val="22"/>
       <w:shd w:color="auto" w:fill="F8F8F8" w:val="clear"/>
     </w:rPr>
   </w:style>
@@ -7948,6 +7958,7 @@
     <w:basedOn w:val="VerbatimChar"/>
     <w:rPr>
       <w:rFonts w:ascii="Consolas" w:hAnsi="Consolas"/>
+      <w:sz w:val="22"/>
       <w:shd w:color="auto" w:fill="F8F8F8" w:val="clear"/>
     </w:rPr>
   </w:style>
@@ -7956,6 +7967,7 @@
     <w:basedOn w:val="VerbatimChar"/>
     <w:rPr>
       <w:rFonts w:ascii="Consolas" w:hAnsi="Consolas"/>
+      <w:sz w:val="22"/>
       <w:shd w:color="auto" w:fill="F8F8F8" w:val="clear"/>
     </w:rPr>
   </w:style>
@@ -7966,6 +7978,7 @@
       <w:rFonts w:ascii="Consolas" w:hAnsi="Consolas"/>
       <w:i/>
       <w:color w:val="8F5902"/>
+      <w:sz w:val="22"/>
       <w:shd w:color="auto" w:fill="F8F8F8" w:val="clear"/>
     </w:rPr>
   </w:style>
@@ -7975,6 +7988,7 @@
     <w:rPr>
       <w:rFonts w:ascii="Consolas" w:hAnsi="Consolas"/>
       <w:color w:val="204A87"/>
+      <w:sz w:val="22"/>
       <w:shd w:color="auto" w:fill="F8F8F8" w:val="clear"/>
     </w:rPr>
   </w:style>
@@ -7983,6 +7997,7 @@
     <w:basedOn w:val="VerbatimChar"/>
     <w:rPr>
       <w:rFonts w:ascii="Consolas" w:hAnsi="Consolas"/>
+      <w:sz w:val="22"/>
       <w:shd w:color="auto" w:fill="F8F8F8" w:val="clear"/>
     </w:rPr>
   </w:style>
@@ -7994,6 +8009,7 @@
       <w:b/>
       <w:i/>
       <w:color w:val="8F5902"/>
+      <w:sz w:val="22"/>
       <w:shd w:color="auto" w:fill="F8F8F8" w:val="clear"/>
     </w:rPr>
   </w:style>
@@ -8005,6 +8021,7 @@
       <w:b/>
       <w:i/>
       <w:color w:val="8F5902"/>
+      <w:sz w:val="22"/>
       <w:shd w:color="auto" w:fill="F8F8F8" w:val="clear"/>
     </w:rPr>
   </w:style>
@@ -8014,6 +8031,7 @@
     <w:rPr>
       <w:rFonts w:ascii="Consolas" w:hAnsi="Consolas"/>
       <w:color w:val="EF2929"/>
+      <w:sz w:val="22"/>
       <w:shd w:color="auto" w:fill="F8F8F8" w:val="clear"/>
     </w:rPr>
   </w:style>
@@ -8024,6 +8042,7 @@
       <w:rFonts w:ascii="Consolas" w:hAnsi="Consolas"/>
       <w:b/>
       <w:color w:val="A40000"/>
+      <w:sz w:val="22"/>
       <w:shd w:color="auto" w:fill="F8F8F8" w:val="clear"/>
     </w:rPr>
   </w:style>
@@ -8034,6 +8053,7 @@
     <w:rPr>
       <w:rFonts w:ascii="Consolas" w:hAnsi="Consolas"/>
       <w:color w:themeColor="text1" w:themeTint="F2" w:val="0D0D0D"/>
+      <w:sz w:val="22"/>
       <w:shd w:color="auto" w:fill="F8F8F8" w:val="clear"/>
     </w:rPr>
   </w:style>

</xml_diff>